<commit_message>
docs: papier CBRI aussi en PDF + refactor contenu partagé
- content.py: source unique du papier (texte, équations, tableaux, figures)
- build_paper.py -> .docx  |  build_pdf.py -> .pdf (reportlab, DejaVuSerif Unicode)
- Umbra_CBRI_Paper.pdf: 7 pages, prêt à présenter
- README: liens PDF + Word
- requirements-dev: reportlab

Co-Authored-By: Claude Opus 4.8 (1M context) <noreply@anthropic.com>
</commit_message>
<xml_diff>
--- a/paper/Umbra_CBRI_Paper.docx
+++ b/paper/Umbra_CBRI_Paper.docx
@@ -51,7 +51,7 @@
     <w:p/>
     <w:p>
       <w:pPr>
-        <w:spacing w:before="80" w:after="200"/>
+        <w:spacing w:after="200"/>
         <w:ind w:left="432" w:right="432"/>
         <w:jc w:val="both"/>
       </w:pPr>
@@ -216,7 +216,7 @@
       <w:r>
         <w:drawing>
           <wp:inline xmlns:a="http://schemas.openxmlformats.org/drawingml/2006/main" xmlns:pic="http://schemas.openxmlformats.org/drawingml/2006/picture">
-            <wp:extent cx="1205345" cy="403167"/>
+            <wp:extent cx="1143000" cy="403167"/>
             <wp:docPr id="1" name="Picture 1"/>
             <wp:cNvGraphicFramePr>
               <a:graphicFrameLocks noChangeAspect="1"/>
@@ -225,7 +225,7 @@
               <a:graphicData uri="http://schemas.openxmlformats.org/drawingml/2006/picture">
                 <pic:pic>
                   <pic:nvPicPr>
-                    <pic:cNvPr id="0" name="eq_6085584683703381987.png"/>
+                    <pic:cNvPr id="0" name="eq_5262234970681983127.png"/>
                     <pic:cNvPicPr/>
                   </pic:nvPicPr>
                   <pic:blipFill>
@@ -237,7 +237,7 @@
                   <pic:spPr>
                     <a:xfrm>
                       <a:off x="0" y="0"/>
-                      <a:ext cx="1205345" cy="403167"/>
+                      <a:ext cx="1143000" cy="403167"/>
                     </a:xfrm>
                     <a:prstGeom prst="rect"/>
                   </pic:spPr>
@@ -303,7 +303,7 @@
       <w:r>
         <w:drawing>
           <wp:inline xmlns:a="http://schemas.openxmlformats.org/drawingml/2006/main" xmlns:pic="http://schemas.openxmlformats.org/drawingml/2006/picture">
-            <wp:extent cx="1429789" cy="532014"/>
+            <wp:extent cx="1321723" cy="532014"/>
             <wp:docPr id="2" name="Picture 2"/>
             <wp:cNvGraphicFramePr>
               <a:graphicFrameLocks noChangeAspect="1"/>
@@ -312,7 +312,7 @@
               <a:graphicData uri="http://schemas.openxmlformats.org/drawingml/2006/picture">
                 <pic:pic>
                   <pic:nvPicPr>
-                    <pic:cNvPr id="0" name="eq_1907505768026712350.png"/>
+                    <pic:cNvPr id="0" name="eq_6771233065029432517.png"/>
                     <pic:cNvPicPr/>
                   </pic:nvPicPr>
                   <pic:blipFill>
@@ -324,7 +324,7 @@
                   <pic:spPr>
                     <a:xfrm>
                       <a:off x="0" y="0"/>
-                      <a:ext cx="1429789" cy="532014"/>
+                      <a:ext cx="1321723" cy="532014"/>
                     </a:xfrm>
                     <a:prstGeom prst="rect"/>
                   </pic:spPr>
@@ -370,7 +370,7 @@
       <w:r>
         <w:drawing>
           <wp:inline xmlns:a="http://schemas.openxmlformats.org/drawingml/2006/main" xmlns:pic="http://schemas.openxmlformats.org/drawingml/2006/picture">
-            <wp:extent cx="1566949" cy="299258"/>
+            <wp:extent cx="1504603" cy="299258"/>
             <wp:docPr id="3" name="Picture 3"/>
             <wp:cNvGraphicFramePr>
               <a:graphicFrameLocks noChangeAspect="1"/>
@@ -379,7 +379,7 @@
               <a:graphicData uri="http://schemas.openxmlformats.org/drawingml/2006/picture">
                 <pic:pic>
                   <pic:nvPicPr>
-                    <pic:cNvPr id="0" name="eq_6087238338031625029.png"/>
+                    <pic:cNvPr id="0" name="eq_3689463844834618408.png"/>
                     <pic:cNvPicPr/>
                   </pic:nvPicPr>
                   <pic:blipFill>
@@ -391,7 +391,7 @@
                   <pic:spPr>
                     <a:xfrm>
                       <a:off x="0" y="0"/>
-                      <a:ext cx="1566949" cy="299258"/>
+                      <a:ext cx="1504603" cy="299258"/>
                     </a:xfrm>
                     <a:prstGeom prst="rect"/>
                   </pic:spPr>
@@ -446,7 +446,7 @@
       <w:r>
         <w:drawing>
           <wp:inline xmlns:a="http://schemas.openxmlformats.org/drawingml/2006/main" xmlns:pic="http://schemas.openxmlformats.org/drawingml/2006/picture">
-            <wp:extent cx="3013363" cy="382385"/>
+            <wp:extent cx="2951018" cy="382385"/>
             <wp:docPr id="4" name="Picture 4"/>
             <wp:cNvGraphicFramePr>
               <a:graphicFrameLocks noChangeAspect="1"/>
@@ -455,7 +455,7 @@
               <a:graphicData uri="http://schemas.openxmlformats.org/drawingml/2006/picture">
                 <pic:pic>
                   <pic:nvPicPr>
-                    <pic:cNvPr id="0" name="eq_500749338286605129.png"/>
+                    <pic:cNvPr id="0" name="eq_1255450792952212581.png"/>
                     <pic:cNvPicPr/>
                   </pic:nvPicPr>
                   <pic:blipFill>
@@ -467,7 +467,7 @@
                   <pic:spPr>
                     <a:xfrm>
                       <a:off x="0" y="0"/>
-                      <a:ext cx="3013363" cy="382385"/>
+                      <a:ext cx="2951018" cy="382385"/>
                     </a:xfrm>
                     <a:prstGeom prst="rect"/>
                   </pic:spPr>
@@ -513,7 +513,7 @@
       <w:r>
         <w:drawing>
           <wp:inline xmlns:a="http://schemas.openxmlformats.org/drawingml/2006/main" xmlns:pic="http://schemas.openxmlformats.org/drawingml/2006/picture">
-            <wp:extent cx="2826327" cy="511232"/>
+            <wp:extent cx="2763981" cy="511232"/>
             <wp:docPr id="5" name="Picture 5"/>
             <wp:cNvGraphicFramePr>
               <a:graphicFrameLocks noChangeAspect="1"/>
@@ -522,7 +522,7 @@
               <a:graphicData uri="http://schemas.openxmlformats.org/drawingml/2006/picture">
                 <pic:pic>
                   <pic:nvPicPr>
-                    <pic:cNvPr id="0" name="eq_5246776203319590712.png"/>
+                    <pic:cNvPr id="0" name="eq_3736355669556586006.png"/>
                     <pic:cNvPicPr/>
                   </pic:nvPicPr>
                   <pic:blipFill>
@@ -534,7 +534,7 @@
                   <pic:spPr>
                     <a:xfrm>
                       <a:off x="0" y="0"/>
-                      <a:ext cx="2826327" cy="511232"/>
+                      <a:ext cx="2763981" cy="511232"/>
                     </a:xfrm>
                     <a:prstGeom prst="rect"/>
                   </pic:spPr>
@@ -582,7 +582,7 @@
       <w:r>
         <w:drawing>
           <wp:inline xmlns:a="http://schemas.openxmlformats.org/drawingml/2006/main" xmlns:pic="http://schemas.openxmlformats.org/drawingml/2006/picture">
-            <wp:extent cx="3724101" cy="328352"/>
+            <wp:extent cx="3661756" cy="328352"/>
             <wp:docPr id="6" name="Picture 6"/>
             <wp:cNvGraphicFramePr>
               <a:graphicFrameLocks noChangeAspect="1"/>
@@ -591,7 +591,7 @@
               <a:graphicData uri="http://schemas.openxmlformats.org/drawingml/2006/picture">
                 <pic:pic>
                   <pic:nvPicPr>
-                    <pic:cNvPr id="0" name="eq_6167737575668850345.png"/>
+                    <pic:cNvPr id="0" name="eq_7192263785359400503.png"/>
                     <pic:cNvPicPr/>
                   </pic:nvPicPr>
                   <pic:blipFill>
@@ -603,7 +603,7 @@
                   <pic:spPr>
                     <a:xfrm>
                       <a:off x="0" y="0"/>
-                      <a:ext cx="3724101" cy="328352"/>
+                      <a:ext cx="3661756" cy="328352"/>
                     </a:xfrm>
                     <a:prstGeom prst="rect"/>
                   </pic:spPr>
@@ -1020,7 +1020,7 @@
       <w:r>
         <w:drawing>
           <wp:inline xmlns:a="http://schemas.openxmlformats.org/drawingml/2006/main" xmlns:pic="http://schemas.openxmlformats.org/drawingml/2006/picture">
-            <wp:extent cx="3183774" cy="340821"/>
+            <wp:extent cx="3150523" cy="340821"/>
             <wp:docPr id="7" name="Picture 7"/>
             <wp:cNvGraphicFramePr>
               <a:graphicFrameLocks noChangeAspect="1"/>
@@ -1029,7 +1029,7 @@
               <a:graphicData uri="http://schemas.openxmlformats.org/drawingml/2006/picture">
                 <pic:pic>
                   <pic:nvPicPr>
-                    <pic:cNvPr id="0" name="eq_4047212184053891381.png"/>
+                    <pic:cNvPr id="0" name="eq_3855336092968186289.png"/>
                     <pic:cNvPicPr/>
                   </pic:nvPicPr>
                   <pic:blipFill>
@@ -1041,7 +1041,7 @@
                   <pic:spPr>
                     <a:xfrm>
                       <a:off x="0" y="0"/>
-                      <a:ext cx="3183774" cy="340821"/>
+                      <a:ext cx="3150523" cy="340821"/>
                     </a:xfrm>
                     <a:prstGeom prst="rect"/>
                   </pic:spPr>
@@ -1069,7 +1069,7 @@
       <w:r>
         <w:drawing>
           <wp:inline xmlns:a="http://schemas.openxmlformats.org/drawingml/2006/main" xmlns:pic="http://schemas.openxmlformats.org/drawingml/2006/picture">
-            <wp:extent cx="4937760" cy="328352"/>
+            <wp:extent cx="4813069" cy="328352"/>
             <wp:docPr id="8" name="Picture 8"/>
             <wp:cNvGraphicFramePr>
               <a:graphicFrameLocks noChangeAspect="1"/>
@@ -1078,7 +1078,7 @@
               <a:graphicData uri="http://schemas.openxmlformats.org/drawingml/2006/picture">
                 <pic:pic>
                   <pic:nvPicPr>
-                    <pic:cNvPr id="0" name="eq_802834444673978905.png"/>
+                    <pic:cNvPr id="0" name="eq_5286748229139102516.png"/>
                     <pic:cNvPicPr/>
                   </pic:nvPicPr>
                   <pic:blipFill>
@@ -1090,7 +1090,7 @@
                   <pic:spPr>
                     <a:xfrm>
                       <a:off x="0" y="0"/>
-                      <a:ext cx="4937760" cy="328352"/>
+                      <a:ext cx="4813069" cy="328352"/>
                     </a:xfrm>
                     <a:prstGeom prst="rect"/>
                   </pic:spPr>
@@ -1118,7 +1118,7 @@
       <w:r>
         <w:drawing>
           <wp:inline xmlns:a="http://schemas.openxmlformats.org/drawingml/2006/main" xmlns:pic="http://schemas.openxmlformats.org/drawingml/2006/picture">
-            <wp:extent cx="3187930" cy="336665"/>
+            <wp:extent cx="3196243" cy="336665"/>
             <wp:docPr id="9" name="Picture 9"/>
             <wp:cNvGraphicFramePr>
               <a:graphicFrameLocks noChangeAspect="1"/>
@@ -1127,7 +1127,7 @@
               <a:graphicData uri="http://schemas.openxmlformats.org/drawingml/2006/picture">
                 <pic:pic>
                   <pic:nvPicPr>
-                    <pic:cNvPr id="0" name="eq_3954062490721904032.png"/>
+                    <pic:cNvPr id="0" name="eq_7986346362804395519.png"/>
                     <pic:cNvPicPr/>
                   </pic:nvPicPr>
                   <pic:blipFill>
@@ -1139,7 +1139,7 @@
                   <pic:spPr>
                     <a:xfrm>
                       <a:off x="0" y="0"/>
-                      <a:ext cx="3187930" cy="336665"/>
+                      <a:ext cx="3196243" cy="336665"/>
                     </a:xfrm>
                     <a:prstGeom prst="rect"/>
                   </pic:spPr>

</xml_diff>